<commit_message>
Internal Py Flask Updates res
</commit_message>
<xml_diff>
--- a/p/res/internal_prof/doc/HCL-Ranjan_PYTHON-FLASK.docx
+++ b/p/res/internal_prof/doc/HCL-Ranjan_PYTHON-FLASK.docx
@@ -222,54 +222,23 @@
           <w:b/>
           <w:color w:val="000000"/>
         </w:rPr>
-        <w:t xml:space="preserve">Python with React JS and Angular, Redis, </w:t>
-      </w:r>
-      <w:r>
-        <w:rPr>
-          <w:rFonts w:hint="default"/>
-          <w:b/>
-          <w:color w:val="000000"/>
-          <w:lang w:val="en-IN"/>
-        </w:rPr>
-        <w:t xml:space="preserve">Postgres DB, </w:t>
-      </w:r>
-      <w:r>
-        <w:rPr>
-          <w:b/>
-          <w:color w:val="000000"/>
-        </w:rPr>
-        <w:t>MongoDb, OracleDb</w:t>
-      </w:r>
-      <w:r>
-        <w:rPr>
-          <w:rFonts w:hint="default"/>
-          <w:b/>
-          <w:color w:val="000000"/>
-          <w:lang w:val="en-IN"/>
-        </w:rPr>
-        <w:t>,</w:t>
-      </w:r>
-      <w:r>
-        <w:rPr>
-          <w:color w:val="000000"/>
-        </w:rPr>
-        <w:t xml:space="preserve"> </w:t>
-      </w:r>
-      <w:r>
-        <w:rPr>
-          <w:b/>
-          <w:color w:val="000000"/>
-        </w:rPr>
-        <w:t>Node.js</w:t>
-      </w:r>
-      <w:r>
-        <w:rPr>
-          <w:rFonts w:hint="default"/>
-          <w:b/>
-          <w:color w:val="000000"/>
-          <w:lang w:val="en-IN"/>
-        </w:rPr>
-        <w:t>, Indexed DB</w:t>
+        <w:t xml:space="preserve">Python </w:t>
+      </w:r>
+      <w:r>
+        <w:rPr>
+          <w:rFonts w:hint="default"/>
+          <w:b/>
+          <w:color w:val="000000"/>
+          <w:lang w:val="en-IN"/>
+        </w:rPr>
+        <w:t xml:space="preserve">for Airflow for ETL process and Flask Python web applications </w:t>
+      </w:r>
+      <w:r>
+        <w:rPr>
+          <w:b/>
+          <w:color w:val="000000"/>
+        </w:rPr>
+        <w:t>with React JS and Angular, Redis</w:t>
       </w:r>
     </w:p>
     <w:p>
@@ -308,7 +277,21 @@
         <w:rPr>
           <w:color w:val="000000"/>
         </w:rPr>
-        <w:t xml:space="preserve"> application serving various needs such as communication, ecommerce, single page web applications, </w:t>
+        <w:t xml:space="preserve"> application serving various needs such as </w:t>
+      </w:r>
+      <w:r>
+        <w:rPr>
+          <w:rFonts w:hint="default"/>
+          <w:color w:val="000000"/>
+          <w:lang w:val="en-IN"/>
+        </w:rPr>
+        <w:t>ETL scheduled job, Analytics, s</w:t>
+      </w:r>
+      <w:r>
+        <w:rPr>
+          <w:color w:val="000000"/>
+        </w:rPr>
+        <w:t xml:space="preserve">ingle page web applications, </w:t>
       </w:r>
       <w:r>
         <w:rPr>
@@ -515,7 +498,7 @@
           <w:color w:val="000000"/>
           <w:lang w:val="en-IN"/>
         </w:rPr>
-        <w:t>/GCP</w:t>
+        <w:t>/Azure</w:t>
       </w:r>
       <w:r>
         <w:rPr>
@@ -531,7 +514,7 @@
           <w:color w:val="000000"/>
           <w:lang w:val="en-IN"/>
         </w:rPr>
-        <w:t>via</w:t>
+        <w:t>also via</w:t>
       </w:r>
       <w:r>
         <w:rPr>
@@ -689,34 +672,51 @@
         <w:jc w:val="both"/>
         <w:rPr>
           <w:rFonts w:hint="default"/>
-          <w:color w:val="000000"/>
-          <w:lang w:val="en-IN"/>
-        </w:rPr>
-      </w:pPr>
-      <w:r>
-        <w:rPr>
-          <w:b/>
-          <w:color w:val="000000"/>
-        </w:rPr>
-        <w:t xml:space="preserve">       Technology</w:t>
-      </w:r>
-      <w:r>
-        <w:rPr>
-          <w:b/>
-          <w:color w:val="000000"/>
+          <w:b/>
+          <w:color w:val="000000"/>
+          <w:lang w:val="en-IN"/>
+        </w:rPr>
+      </w:pPr>
+      <w:r>
+        <w:rPr>
+          <w:b/>
+          <w:color w:val="000000"/>
+        </w:rPr>
+        <w:t xml:space="preserve">      </w:t>
+      </w:r>
+      <w:r>
+        <w:rPr>
+          <w:rFonts w:hint="default"/>
+          <w:b/>
+          <w:color w:val="000000"/>
+          <w:lang w:val="en-IN"/>
+        </w:rPr>
+        <w:t>Application</w:t>
+      </w:r>
+      <w:r>
+        <w:rPr>
+          <w:rFonts w:hint="default"/>
+          <w:b/>
+          <w:color w:val="000000"/>
+          <w:lang w:val="en-IN"/>
         </w:rPr>
         <w:tab/>
       </w:r>
       <w:r>
         <w:rPr>
-          <w:b/>
-          <w:color w:val="000000"/>
+          <w:rFonts w:hint="default"/>
+          <w:b/>
+          <w:color w:val="000000"/>
+          <w:lang w:val="en-IN"/>
         </w:rPr>
         <w:tab/>
       </w:r>
       <w:r>
         <w:rPr>
-          <w:color w:val="000000"/>
+          <w:rFonts w:hint="default"/>
+          <w:b/>
+          <w:color w:val="000000"/>
+          <w:lang w:val="en-IN"/>
         </w:rPr>
         <w:t xml:space="preserve">:  </w:t>
       </w:r>
@@ -735,7 +735,6 @@
           <w:lang w:val="en-IN"/>
         </w:rPr>
         <w:tab/>
-        <w:t/>
       </w:r>
       <w:r>
         <w:rPr>
@@ -744,7 +743,6 @@
           <w:lang w:val="en-IN"/>
         </w:rPr>
         <w:tab/>
-        <w:t/>
       </w:r>
       <w:r>
         <w:rPr>
@@ -753,7 +751,6 @@
           <w:lang w:val="en-IN"/>
         </w:rPr>
         <w:tab/>
-        <w:t/>
       </w:r>
       <w:r>
         <w:rPr>
@@ -762,7 +759,6 @@
           <w:lang w:val="en-IN"/>
         </w:rPr>
         <w:tab/>
-        <w:t/>
       </w:r>
       <w:r>
         <w:rPr>
@@ -771,6 +767,13 @@
           <w:lang w:val="en-IN"/>
         </w:rPr>
         <w:tab/>
+      </w:r>
+      <w:r>
+        <w:rPr>
+          <w:rFonts w:hint="default"/>
+          <w:color w:val="000000"/>
+          <w:lang w:val="en-IN"/>
+        </w:rPr>
         <w:t xml:space="preserve">Modern / Hybrid App Development, Extension &amp; App development, Redhat </w:t>
       </w:r>
       <w:r>
@@ -780,7 +783,6 @@
           <w:lang w:val="en-IN"/>
         </w:rPr>
         <w:tab/>
-        <w:t/>
       </w:r>
       <w:r>
         <w:rPr>
@@ -789,7 +791,6 @@
           <w:lang w:val="en-IN"/>
         </w:rPr>
         <w:tab/>
-        <w:t/>
       </w:r>
       <w:r>
         <w:rPr>
@@ -798,7 +799,6 @@
           <w:lang w:val="en-IN"/>
         </w:rPr>
         <w:tab/>
-        <w:t/>
       </w:r>
       <w:r>
         <w:rPr>
@@ -807,6 +807,13 @@
           <w:lang w:val="en-IN"/>
         </w:rPr>
         <w:tab/>
+      </w:r>
+      <w:r>
+        <w:rPr>
+          <w:rFonts w:hint="default"/>
+          <w:color w:val="000000"/>
+          <w:lang w:val="en-IN"/>
+        </w:rPr>
         <w:t>Openshift - Multi Cloud Management,</w:t>
       </w:r>
     </w:p>
@@ -819,6 +826,7 @@
           <w:right w:val="none" w:color="auto" w:sz="0" w:space="0"/>
           <w:between w:val="none" w:color="auto" w:sz="0" w:space="0"/>
         </w:pBdr>
+        <w:ind w:firstLine="330" w:firstLineChars="150"/>
         <w:jc w:val="both"/>
         <w:rPr>
           <w:rFonts w:hint="default"/>
@@ -831,6 +839,58 @@
           <w:b/>
           <w:color w:val="000000"/>
         </w:rPr>
+        <w:t>Technology</w:t>
+      </w:r>
+      <w:r>
+        <w:rPr>
+          <w:b/>
+          <w:color w:val="000000"/>
+        </w:rPr>
+        <w:tab/>
+      </w:r>
+      <w:r>
+        <w:rPr>
+          <w:b/>
+          <w:color w:val="000000"/>
+        </w:rPr>
+        <w:tab/>
+      </w:r>
+      <w:r>
+        <w:rPr>
+          <w:color w:val="000000"/>
+        </w:rPr>
+        <w:t>:</w:t>
+      </w:r>
+      <w:r>
+        <w:rPr>
+          <w:rFonts w:hint="default"/>
+          <w:color w:val="000000"/>
+          <w:lang w:val="en-IN"/>
+        </w:rPr>
+        <w:t xml:space="preserve"> Development, DevOps, Python, Databases, Node, Application Cloud Deployment and Multi Platform Deployment such as Android/iOS/Windows Store. Python Automation</w:t>
+      </w:r>
+    </w:p>
+    <w:p>
+      <w:pPr>
+        <w:pBdr>
+          <w:top w:val="none" w:color="auto" w:sz="0" w:space="0"/>
+          <w:left w:val="none" w:color="auto" w:sz="0" w:space="0"/>
+          <w:bottom w:val="none" w:color="auto" w:sz="0" w:space="0"/>
+          <w:right w:val="none" w:color="auto" w:sz="0" w:space="0"/>
+          <w:between w:val="none" w:color="auto" w:sz="0" w:space="0"/>
+        </w:pBdr>
+        <w:jc w:val="both"/>
+        <w:rPr>
+          <w:rFonts w:hint="default"/>
+          <w:color w:val="000000"/>
+          <w:lang w:val="en-IN"/>
+        </w:rPr>
+      </w:pPr>
+      <w:r>
+        <w:rPr>
+          <w:b/>
+          <w:color w:val="000000"/>
+        </w:rPr>
         <w:t xml:space="preserve">       Frameworks</w:t>
       </w:r>
       <w:r>
@@ -844,7 +904,21 @@
         <w:rPr>
           <w:color w:val="000000"/>
         </w:rPr>
-        <w:t>:  Flask PY, Python,</w:t>
+        <w:t>: Flask P</w:t>
+      </w:r>
+      <w:r>
+        <w:rPr>
+          <w:rFonts w:hint="default"/>
+          <w:color w:val="000000"/>
+          <w:lang w:val="en-IN"/>
+        </w:rPr>
+        <w:t>y, Django Py</w:t>
+      </w:r>
+      <w:r>
+        <w:rPr>
+          <w:color w:val="000000"/>
+        </w:rPr>
+        <w:t>, Python,</w:t>
       </w:r>
       <w:r>
         <w:rPr>
@@ -876,16 +950,14 @@
           <w:color w:val="000000"/>
           <w:lang w:val="en-IN"/>
         </w:rPr>
-        <w:t xml:space="preserve">Node.js, </w:t>
-      </w:r>
-      <w:r>
-        <w:rPr>
-          <w:rFonts w:hint="default"/>
+        <w:t xml:space="preserve">Node.js, NextJs, React JS, Angular, </w:t>
+      </w:r>
+      <w:r>
+        <w:rPr>
           <w:bCs/>
           <w:color w:val="000000"/>
-          <w:lang w:val="en-IN"/>
-        </w:rPr>
-        <w:br w:type="textWrapping"/>
+        </w:rPr>
+        <w:t>Java Jmeter</w:t>
       </w:r>
       <w:r>
         <w:rPr>
@@ -894,34 +966,158 @@
           <w:color w:val="000000"/>
           <w:lang w:val="en-IN"/>
         </w:rPr>
+        <w:t>, Electron JS</w:t>
+      </w:r>
+    </w:p>
+    <w:p>
+      <w:pPr>
+        <w:pBdr>
+          <w:top w:val="none" w:color="auto" w:sz="0" w:space="0"/>
+          <w:left w:val="none" w:color="auto" w:sz="0" w:space="0"/>
+          <w:bottom w:val="none" w:color="auto" w:sz="0" w:space="0"/>
+          <w:right w:val="none" w:color="auto" w:sz="0" w:space="0"/>
+          <w:between w:val="none" w:color="auto" w:sz="0" w:space="0"/>
+        </w:pBdr>
+        <w:jc w:val="both"/>
+        <w:rPr>
+          <w:bCs/>
+          <w:color w:val="000000"/>
+        </w:rPr>
+      </w:pPr>
+      <w:r>
+        <w:rPr>
+          <w:b/>
+          <w:color w:val="000000"/>
+        </w:rPr>
+        <w:t xml:space="preserve">       Database</w:t>
+      </w:r>
+      <w:r>
+        <w:rPr>
+          <w:b/>
+          <w:color w:val="000000"/>
+        </w:rPr>
         <w:tab/>
-        <w:t/>
-      </w:r>
-      <w:r>
+      </w:r>
+      <w:r>
+        <w:rPr>
+          <w:b/>
+          <w:color w:val="000000"/>
+        </w:rPr>
+        <w:tab/>
+      </w:r>
+      <w:r>
+        <w:rPr>
+          <w:rFonts w:hint="default"/>
+          <w:b/>
+          <w:color w:val="000000"/>
+          <w:lang w:val="en-IN"/>
+        </w:rPr>
+        <w:t>:</w:t>
+      </w:r>
+      <w:r>
+        <w:rPr>
+          <w:color w:val="000000"/>
+        </w:rPr>
+        <w:t xml:space="preserve">  </w:t>
+      </w:r>
+      <w:r>
+        <w:rPr>
+          <w:rFonts w:hint="default"/>
+          <w:color w:val="000000"/>
+          <w:lang w:val="en-IN"/>
+        </w:rPr>
+        <w:t xml:space="preserve">OracleDb, </w:t>
+      </w:r>
+      <w:r>
+        <w:rPr>
+          <w:color w:val="000000"/>
+        </w:rPr>
+        <w:t>Postgres</w:t>
+      </w:r>
+      <w:r>
+        <w:rPr>
+          <w:rFonts w:hint="default"/>
+          <w:color w:val="000000"/>
+          <w:lang w:val="en-IN"/>
+        </w:rPr>
+        <w:t>Db</w:t>
+      </w:r>
+      <w:r>
+        <w:rPr>
+          <w:color w:val="000000"/>
+        </w:rPr>
+        <w:t>, MongoDB, Redis, Dynamo DB, Cosmos Db</w:t>
+      </w:r>
+    </w:p>
+    <w:p>
+      <w:pPr>
+        <w:pBdr>
+          <w:top w:val="none" w:color="auto" w:sz="0" w:space="0"/>
+          <w:left w:val="none" w:color="auto" w:sz="0" w:space="0"/>
+          <w:bottom w:val="none" w:color="auto" w:sz="0" w:space="0"/>
+          <w:right w:val="none" w:color="auto" w:sz="0" w:space="0"/>
+          <w:between w:val="none" w:color="auto" w:sz="0" w:space="0"/>
+        </w:pBdr>
+        <w:jc w:val="both"/>
         <w:rPr>
           <w:rFonts w:hint="default"/>
           <w:bCs/>
-          <w:color w:val="000000"/>
-          <w:lang w:val="en-IN"/>
+          <w:lang w:val="en-IN"/>
+        </w:rPr>
+      </w:pPr>
+      <w:r>
+        <w:rPr>
+          <w:b/>
+          <w:color w:val="000000"/>
+        </w:rPr>
+        <w:t xml:space="preserve">       DevOps                      </w:t>
+      </w:r>
+      <w:r>
+        <w:rPr>
+          <w:b/>
+          <w:color w:val="000000"/>
         </w:rPr>
         <w:tab/>
-        <w:t/>
-      </w:r>
-      <w:r>
-        <w:rPr>
-          <w:rFonts w:hint="default"/>
+      </w:r>
+      <w:r>
+        <w:rPr>
+          <w:color w:val="000000"/>
+        </w:rPr>
+        <w:t xml:space="preserve">:  </w:t>
+      </w:r>
+      <w:r>
+        <w:rPr>
           <w:bCs/>
           <w:color w:val="000000"/>
+        </w:rPr>
+        <w:t>Docker, Kubernetes, S3 bucket, Push Notification</w:t>
+      </w:r>
+      <w:r>
+        <w:rPr>
+          <w:rFonts w:hint="default"/>
+          <w:bCs/>
+          <w:color w:val="000000"/>
+          <w:lang w:val="en-IN"/>
+        </w:rPr>
+        <w:t xml:space="preserve">, Cloud Formation, </w:t>
+      </w:r>
+      <w:r>
+        <w:rPr>
+          <w:rFonts w:hint="default"/>
+          <w:bCs/>
+          <w:color w:val="000000"/>
           <w:lang w:val="en-IN"/>
         </w:rPr>
         <w:tab/>
       </w:r>
       <w:r>
         <w:rPr>
+          <w:rFonts w:hint="default"/>
           <w:bCs/>
           <w:color w:val="000000"/>
-        </w:rPr>
-        <w:t>Java Jmeter</w:t>
+          <w:lang w:val="en-IN"/>
+        </w:rPr>
+        <w:tab/>
       </w:r>
       <w:r>
         <w:rPr>
@@ -930,103 +1126,52 @@
           <w:color w:val="000000"/>
           <w:lang w:val="en-IN"/>
         </w:rPr>
-        <w:t>, Electron JS</w:t>
-      </w:r>
-    </w:p>
-    <w:p>
-      <w:pPr>
-        <w:pBdr>
-          <w:top w:val="none" w:color="auto" w:sz="0" w:space="0"/>
-          <w:left w:val="none" w:color="auto" w:sz="0" w:space="0"/>
-          <w:bottom w:val="none" w:color="auto" w:sz="0" w:space="0"/>
-          <w:right w:val="none" w:color="auto" w:sz="0" w:space="0"/>
-          <w:between w:val="none" w:color="auto" w:sz="0" w:space="0"/>
-        </w:pBdr>
-        <w:jc w:val="both"/>
-        <w:rPr>
+        <w:tab/>
+      </w:r>
+      <w:r>
+        <w:rPr>
+          <w:rFonts w:hint="default"/>
           <w:bCs/>
           <w:color w:val="000000"/>
-        </w:rPr>
-      </w:pPr>
-      <w:r>
-        <w:rPr>
-          <w:b/>
-          <w:color w:val="000000"/>
-        </w:rPr>
-        <w:t xml:space="preserve">       Database</w:t>
-      </w:r>
-      <w:r>
-        <w:rPr>
-          <w:b/>
-          <w:color w:val="000000"/>
+          <w:lang w:val="en-IN"/>
         </w:rPr>
         <w:tab/>
       </w:r>
       <w:r>
         <w:rPr>
-          <w:b/>
-          <w:color w:val="000000"/>
+          <w:rFonts w:hint="default"/>
+          <w:bCs/>
+          <w:color w:val="000000"/>
+          <w:lang w:val="en-IN"/>
         </w:rPr>
         <w:tab/>
       </w:r>
       <w:r>
         <w:rPr>
           <w:rFonts w:hint="default"/>
-          <w:b/>
-          <w:color w:val="000000"/>
-          <w:lang w:val="en-IN"/>
-        </w:rPr>
-        <w:t>:</w:t>
-      </w:r>
-      <w:r>
-        <w:rPr>
-          <w:color w:val="000000"/>
-        </w:rPr>
-        <w:t xml:space="preserve">  Postgres, MongoDB, Redis, Dynamo DB, Oracle DB, Cosmos Db</w:t>
-      </w:r>
-    </w:p>
-    <w:p>
-      <w:pPr>
-        <w:pBdr>
-          <w:top w:val="none" w:color="auto" w:sz="0" w:space="0"/>
-          <w:left w:val="none" w:color="auto" w:sz="0" w:space="0"/>
-          <w:bottom w:val="none" w:color="auto" w:sz="0" w:space="0"/>
-          <w:right w:val="none" w:color="auto" w:sz="0" w:space="0"/>
-          <w:between w:val="none" w:color="auto" w:sz="0" w:space="0"/>
-        </w:pBdr>
-        <w:jc w:val="both"/>
-        <w:rPr>
-          <w:rFonts w:hint="default"/>
           <w:bCs/>
-          <w:lang w:val="en-IN"/>
-        </w:rPr>
-      </w:pPr>
-      <w:r>
-        <w:rPr>
-          <w:b/>
-          <w:color w:val="000000"/>
-        </w:rPr>
-        <w:t xml:space="preserve">       DevOps                      </w:t>
-      </w:r>
-      <w:r>
-        <w:rPr>
-          <w:b/>
-          <w:color w:val="000000"/>
+          <w:color w:val="000000"/>
+          <w:lang w:val="en-IN"/>
+        </w:rPr>
+        <w:t xml:space="preserve">Step Functions, Athena, Glue, Pub/Sub, YAML, Kinesis, Lambda, EMR, </w:t>
+      </w:r>
+      <w:r>
+        <w:rPr>
+          <w:rFonts w:hint="default"/>
+          <w:bCs/>
+          <w:color w:val="000000"/>
+          <w:lang w:val="en-IN"/>
         </w:rPr>
         <w:tab/>
       </w:r>
       <w:r>
         <w:rPr>
-          <w:color w:val="000000"/>
-        </w:rPr>
-        <w:t xml:space="preserve">:  </w:t>
-      </w:r>
-      <w:r>
-        <w:rPr>
+          <w:rFonts w:hint="default"/>
           <w:bCs/>
           <w:color w:val="000000"/>
-        </w:rPr>
-        <w:t>Docker, Kubernetes, S3 bucket, Push Notification</w:t>
+          <w:lang w:val="en-IN"/>
+        </w:rPr>
+        <w:tab/>
       </w:r>
       <w:r>
         <w:rPr>
@@ -1035,7 +1180,7 @@
           <w:color w:val="000000"/>
           <w:lang w:val="en-IN"/>
         </w:rPr>
-        <w:t xml:space="preserve">, Cloud Formation, </w:t>
+        <w:tab/>
       </w:r>
       <w:r>
         <w:rPr>
@@ -1045,7 +1190,6 @@
           <w:lang w:val="en-IN"/>
         </w:rPr>
         <w:tab/>
-        <w:t/>
       </w:r>
       <w:r>
         <w:rPr>
@@ -1055,7 +1199,6 @@
           <w:lang w:val="en-IN"/>
         </w:rPr>
         <w:tab/>
-        <w:t/>
       </w:r>
       <w:r>
         <w:rPr>
@@ -1064,77 +1207,6 @@
           <w:color w:val="000000"/>
           <w:lang w:val="en-IN"/>
         </w:rPr>
-        <w:tab/>
-        <w:t/>
-      </w:r>
-      <w:r>
-        <w:rPr>
-          <w:rFonts w:hint="default"/>
-          <w:bCs/>
-          <w:color w:val="000000"/>
-          <w:lang w:val="en-IN"/>
-        </w:rPr>
-        <w:tab/>
-        <w:t/>
-      </w:r>
-      <w:r>
-        <w:rPr>
-          <w:rFonts w:hint="default"/>
-          <w:bCs/>
-          <w:color w:val="000000"/>
-          <w:lang w:val="en-IN"/>
-        </w:rPr>
-        <w:tab/>
-        <w:t xml:space="preserve">Step Functions, Athena, Glue, Pub/Sub, YAML, Kinesis, Lambda, EMR, </w:t>
-      </w:r>
-      <w:r>
-        <w:rPr>
-          <w:rFonts w:hint="default"/>
-          <w:bCs/>
-          <w:color w:val="000000"/>
-          <w:lang w:val="en-IN"/>
-        </w:rPr>
-        <w:tab/>
-        <w:t/>
-      </w:r>
-      <w:r>
-        <w:rPr>
-          <w:rFonts w:hint="default"/>
-          <w:bCs/>
-          <w:color w:val="000000"/>
-          <w:lang w:val="en-IN"/>
-        </w:rPr>
-        <w:tab/>
-        <w:t/>
-      </w:r>
-      <w:r>
-        <w:rPr>
-          <w:rFonts w:hint="default"/>
-          <w:bCs/>
-          <w:color w:val="000000"/>
-          <w:lang w:val="en-IN"/>
-        </w:rPr>
-        <w:tab/>
-        <w:t/>
-      </w:r>
-      <w:r>
-        <w:rPr>
-          <w:rFonts w:hint="default"/>
-          <w:bCs/>
-          <w:color w:val="000000"/>
-          <w:lang w:val="en-IN"/>
-        </w:rPr>
-        <w:tab/>
-        <w:t/>
-      </w:r>
-      <w:r>
-        <w:rPr>
-          <w:rFonts w:hint="default"/>
-          <w:bCs/>
-          <w:color w:val="000000"/>
-          <w:lang w:val="en-IN"/>
-        </w:rPr>
-        <w:tab/>
         <w:t xml:space="preserve">CloudWatch, Splunk, SonarQube, SNS, SQS, EKS, EBS, EFS, </w:t>
       </w:r>
     </w:p>
@@ -1234,6 +1306,10 @@
     <w:p>
       <w:pPr>
         <w:spacing w:after="0"/>
+        <w:rPr>
+          <w:rFonts w:hint="default"/>
+          <w:lang w:val="en-IN"/>
+        </w:rPr>
       </w:pPr>
       <w:r>
         <w:rPr>
@@ -1255,10 +1331,20 @@
           <w:rFonts w:hint="default"/>
           <w:lang w:val="en-IN"/>
         </w:rPr>
-        <w:t xml:space="preserve">Next JS / Typescript Azure Node.js data ETL </w:t>
-      </w:r>
-      <w:r>
-        <w:t xml:space="preserve">web services, </w:t>
+        <w:t xml:space="preserve">Python Airflow pipeline data jobs / Azure data ETL </w:t>
+      </w:r>
+      <w:r>
+        <w:t>web services</w:t>
+      </w:r>
+      <w:r>
+        <w:rPr>
+          <w:rFonts w:hint="default"/>
+          <w:lang w:val="en-IN"/>
+        </w:rPr>
+        <w:t>, OracleDb and</w:t>
+      </w:r>
+      <w:r>
+        <w:t xml:space="preserve"> </w:t>
       </w:r>
       <w:r>
         <w:rPr>
@@ -1268,7 +1354,14 @@
         <w:t>Postgres</w:t>
       </w:r>
       <w:r>
-        <w:t xml:space="preserve"> DB, Redis</w:t>
+        <w:t>DB, Redis</w:t>
+      </w:r>
+      <w:r>
+        <w:rPr>
+          <w:rFonts w:hint="default"/>
+          <w:lang w:val="en-IN"/>
+        </w:rPr>
+        <w:t>.</w:t>
       </w:r>
     </w:p>
     <w:p>
@@ -1326,7 +1419,7 @@
           <w:rFonts w:hint="default"/>
           <w:lang w:val="en-IN"/>
         </w:rPr>
-        <w:t>develop and maintain data enrichment workflows via cron for UI fetch and later analytics</w:t>
+        <w:t>develop and maintain data enrichment workflows via Airflow jobs which gets scheduled as cron for UI fetch and later analytics</w:t>
       </w:r>
     </w:p>
     <w:p>
@@ -3495,6 +3588,668 @@
       </w:pPr>
       <w:r>
         <w:rPr>
+          <w:rFonts w:hint="default"/>
+          <w:b/>
+          <w:color w:val="000000"/>
+          <w:sz w:val="24"/>
+          <w:szCs w:val="24"/>
+        </w:rPr>
+        <mc:AlternateContent>
+          <mc:Choice Requires="wpg">
+            <w:drawing>
+              <wp:anchor distT="0" distB="0" distL="114300" distR="114300" simplePos="0" relativeHeight="251659264" behindDoc="0" locked="0" layoutInCell="1" allowOverlap="1">
+                <wp:simplePos x="0" y="0"/>
+                <wp:positionH relativeFrom="column">
+                  <wp:posOffset>6350</wp:posOffset>
+                </wp:positionH>
+                <wp:positionV relativeFrom="page">
+                  <wp:posOffset>272415</wp:posOffset>
+                </wp:positionV>
+                <wp:extent cx="6116320" cy="92710"/>
+                <wp:effectExtent l="33655" t="7620" r="34925" b="1270"/>
+                <wp:wrapNone/>
+                <wp:docPr id="1" name="Group 1"/>
+                <wp:cNvGraphicFramePr/>
+                <a:graphic xmlns:a="http://schemas.openxmlformats.org/drawingml/2006/main">
+                  <a:graphicData uri="http://schemas.microsoft.com/office/word/2010/wordprocessingGroup">
+                    <wpg:wgp>
+                      <wpg:cNvGrpSpPr/>
+                      <wpg:grpSpPr>
+                        <a:xfrm>
+                          <a:off x="0" y="0"/>
+                          <a:ext cx="6116320" cy="92710"/>
+                          <a:chOff x="1740" y="9146"/>
+                          <a:chExt cx="9632" cy="146"/>
+                        </a:xfrm>
+                      </wpg:grpSpPr>
+                      <wps:wsp>
+                        <wps:cNvPr id="49" name="Straight Connector 14"/>
+                        <wps:cNvCnPr/>
+                        <wps:spPr>
+                          <a:xfrm flipV="1">
+                            <a:off x="1740" y="9156"/>
+                            <a:ext cx="9632" cy="10"/>
+                          </a:xfrm>
+                          <a:prstGeom prst="line">
+                            <a:avLst/>
+                          </a:prstGeom>
+                        </wps:spPr>
+                        <wps:style>
+                          <a:lnRef idx="2">
+                            <a:schemeClr val="dk1"/>
+                          </a:lnRef>
+                          <a:fillRef idx="0">
+                            <a:schemeClr val="dk1"/>
+                          </a:fillRef>
+                          <a:effectRef idx="1">
+                            <a:schemeClr val="dk1"/>
+                          </a:effectRef>
+                          <a:fontRef idx="minor">
+                            <a:schemeClr val="tx1"/>
+                          </a:fontRef>
+                        </wps:style>
+                        <wps:bodyPr/>
+                      </wps:wsp>
+                      <wps:wsp>
+                        <wps:cNvPr id="50" name="Freeform 22"/>
+                        <wps:cNvSpPr/>
+                        <wps:spPr>
+                          <a:xfrm flipV="1">
+                            <a:off x="9910" y="9146"/>
+                            <a:ext cx="1462" cy="147"/>
+                          </a:xfrm>
+                          <a:custGeom>
+                            <a:avLst/>
+                            <a:gdLst>
+                              <a:gd name="connisteX0" fmla="*/ 0 w 928370"/>
+                              <a:gd name="connsiteY0" fmla="*/ 93345 h 93345"/>
+                              <a:gd name="connisteX1" fmla="*/ 928370 w 928370"/>
+                              <a:gd name="connsiteY1" fmla="*/ 93345 h 93345"/>
+                              <a:gd name="connisteX2" fmla="*/ 928370 w 928370"/>
+                              <a:gd name="connsiteY2" fmla="*/ 0 h 93345"/>
+                              <a:gd name="connisteX3" fmla="*/ 198755 w 928370"/>
+                              <a:gd name="connsiteY3" fmla="*/ 0 h 93345"/>
+                              <a:gd name="connisteX4" fmla="*/ 0 w 928370"/>
+                              <a:gd name="connsiteY4" fmla="*/ 93345 h 93345"/>
+                            </a:gdLst>
+                            <a:ahLst/>
+                            <a:cxnLst>
+                              <a:cxn ang="0">
+                                <a:pos x="connisteX0" y="connsiteY0"/>
+                              </a:cxn>
+                              <a:cxn ang="0">
+                                <a:pos x="connisteX1" y="connsiteY1"/>
+                              </a:cxn>
+                              <a:cxn ang="0">
+                                <a:pos x="connisteX2" y="connsiteY2"/>
+                              </a:cxn>
+                              <a:cxn ang="0">
+                                <a:pos x="connisteX3" y="connsiteY3"/>
+                              </a:cxn>
+                              <a:cxn ang="0">
+                                <a:pos x="connisteX4" y="connsiteY4"/>
+                              </a:cxn>
+                            </a:cxnLst>
+                            <a:rect l="l" t="t" r="r" b="b"/>
+                            <a:pathLst>
+                              <a:path w="928370" h="93345">
+                                <a:moveTo>
+                                  <a:pt x="0" y="93345"/>
+                                </a:moveTo>
+                                <a:lnTo>
+                                  <a:pt x="928370" y="93345"/>
+                                </a:lnTo>
+                                <a:lnTo>
+                                  <a:pt x="928370" y="0"/>
+                                </a:lnTo>
+                                <a:lnTo>
+                                  <a:pt x="198755" y="0"/>
+                                </a:lnTo>
+                                <a:lnTo>
+                                  <a:pt x="0" y="93345"/>
+                                </a:lnTo>
+                                <a:close/>
+                              </a:path>
+                            </a:pathLst>
+                          </a:custGeom>
+                          <a:solidFill>
+                            <a:schemeClr val="tx1"/>
+                          </a:solidFill>
+                          <a:ln>
+                            <a:noFill/>
+                          </a:ln>
+                        </wps:spPr>
+                        <wps:style>
+                          <a:lnRef idx="2">
+                            <a:schemeClr val="accent1">
+                              <a:lumMod val="75000"/>
+                            </a:schemeClr>
+                          </a:lnRef>
+                          <a:fillRef idx="1">
+                            <a:schemeClr val="accent1"/>
+                          </a:fillRef>
+                          <a:effectRef idx="0">
+                            <a:srgbClr val="FFFFFF"/>
+                          </a:effectRef>
+                          <a:fontRef idx="minor">
+                            <a:schemeClr val="lt1"/>
+                          </a:fontRef>
+                        </wps:style>
+                        <wps:bodyPr/>
+                      </wps:wsp>
+                    </wpg:wgp>
+                  </a:graphicData>
+                </a:graphic>
+              </wp:anchor>
+            </w:drawing>
+          </mc:Choice>
+          <mc:Fallback>
+            <w:pict>
+              <v:group id="_x0000_s1026" o:spid="_x0000_s1026" o:spt="203" style="position:absolute;left:0pt;margin-left:0.5pt;margin-top:21.45pt;height:7.3pt;width:481.6pt;mso-position-vertical-relative:page;z-index:251659264;mso-width-relative:page;mso-height-relative:page;" coordorigin="1740,9146" coordsize="9632,146" o:gfxdata="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">
+                <o:lock v:ext="edit" aspectratio="f"/>
+                <v:line id="Straight Connector 14" o:spid="_x0000_s1026" o:spt="20" style="position:absolute;left:1740;top:9156;flip:y;height:10;width:9632;" filled="f" stroked="t" coordsize="21600,21600" o:gfxdata="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">
+                  <v:fill on="f" focussize="0,0"/>
+                  <v:stroke weight="2pt" color="#000000 [3200]" joinstyle="round"/>
+                  <v:imagedata o:title=""/>
+                  <o:lock v:ext="edit" aspectratio="f"/>
+                  <v:shadow on="t" color="#000000" opacity="24903f" offset="0pt,1.5748031496063pt" origin="0f,32768f" matrix="65536f,0f,0f,65536f"/>
+                </v:line>
+                <v:shape id="Freeform 22" o:spid="_x0000_s1026" o:spt="100" style="position:absolute;left:9910;top:9146;flip:y;height:147;width:1462;" fillcolor="#000000 [3213]" filled="t" stroked="f" coordsize="928370,93345" o:gfxdata="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" path="m0,93345l928370,93345,928370,0,198755,0,0,93345xe">
+                  <v:path o:connectlocs="0,147;1462,147;1462,0;313,0;0,147" o:connectangles="0,0,0,0,0"/>
+                  <v:fill on="t" focussize="0,0"/>
+                  <v:stroke on="f" weight="2pt"/>
+                  <v:imagedata o:title=""/>
+                  <o:lock v:ext="edit" aspectratio="f"/>
+                </v:shape>
+              </v:group>
+            </w:pict>
+          </mc:Fallback>
+        </mc:AlternateContent>
+      </w:r>
+      <w:r>
+        <w:rPr>
+          <w:rFonts w:hint="default"/>
+          <w:b/>
+          <w:color w:val="000000"/>
+          <w:sz w:val="24"/>
+          <w:szCs w:val="24"/>
+          <w:lang w:val="en-IN"/>
+        </w:rPr>
+        <w:t>Professional Certifications and Training Completed:</w:t>
+      </w:r>
+    </w:p>
+    <w:p>
+      <w:pPr>
+        <w:pStyle w:val="15"/>
+        <w:widowControl w:val="0"/>
+        <w:numPr>
+          <w:ilvl w:val="0"/>
+          <w:numId w:val="7"/>
+        </w:numPr>
+        <w:pBdr>
+          <w:top w:val="none" w:color="auto" w:sz="0" w:space="0"/>
+          <w:left w:val="none" w:color="auto" w:sz="0" w:space="0"/>
+          <w:bottom w:val="none" w:color="auto" w:sz="0" w:space="0"/>
+          <w:right w:val="none" w:color="auto" w:sz="0" w:space="0"/>
+          <w:between w:val="none" w:color="auto" w:sz="0" w:space="0"/>
+        </w:pBdr>
+        <w:tabs>
+          <w:tab w:val="left" w:pos="720"/>
+        </w:tabs>
+        <w:spacing w:after="0"/>
+        <w:ind w:right="-180"/>
+        <w:rPr>
+          <w:rFonts w:hint="default"/>
+          <w:b/>
+          <w:color w:val="000000"/>
+          <w:sz w:val="24"/>
+          <w:szCs w:val="24"/>
+          <w:highlight w:val="white"/>
+          <w:lang w:val="en-IN"/>
+        </w:rPr>
+      </w:pPr>
+      <w:r>
+        <w:rPr>
+          <w:rFonts w:hint="default"/>
+          <w:b w:val="0"/>
+          <w:bCs/>
+          <w:color w:val="000000"/>
+          <w:sz w:val="24"/>
+          <w:szCs w:val="24"/>
+          <w:highlight w:val="white"/>
+          <w:lang w:val="en-IN"/>
+        </w:rPr>
+        <w:t>2024 Assessment for: US Healthcare overview, Hipaa compliance, Electronic Medical Health records, Healthcare Interoperability, US Healthcare providers, Physician payments sunshine act overview 2024</w:t>
+      </w:r>
+    </w:p>
+    <w:p>
+      <w:pPr>
+        <w:pStyle w:val="15"/>
+        <w:widowControl w:val="0"/>
+        <w:numPr>
+          <w:ilvl w:val="0"/>
+          <w:numId w:val="7"/>
+        </w:numPr>
+        <w:pBdr>
+          <w:top w:val="none" w:color="auto" w:sz="0" w:space="0"/>
+          <w:left w:val="none" w:color="auto" w:sz="0" w:space="0"/>
+          <w:bottom w:val="none" w:color="auto" w:sz="0" w:space="0"/>
+          <w:right w:val="none" w:color="auto" w:sz="0" w:space="0"/>
+          <w:between w:val="none" w:color="auto" w:sz="0" w:space="0"/>
+        </w:pBdr>
+        <w:tabs>
+          <w:tab w:val="left" w:pos="720"/>
+        </w:tabs>
+        <w:spacing w:after="0"/>
+        <w:ind w:right="-180"/>
+        <w:rPr>
+          <w:rFonts w:hint="default"/>
+          <w:b/>
+          <w:color w:val="000000"/>
+          <w:sz w:val="24"/>
+          <w:szCs w:val="24"/>
+          <w:highlight w:val="white"/>
+          <w:lang w:val="en-IN" w:eastAsia="zh-CN"/>
+        </w:rPr>
+      </w:pPr>
+      <w:r>
+        <w:rPr>
+          <w:rFonts w:hint="default"/>
+          <w:b w:val="0"/>
+          <w:bCs/>
+          <w:color w:val="000000"/>
+          <w:sz w:val="24"/>
+          <w:szCs w:val="24"/>
+          <w:highlight w:val="white"/>
+          <w:lang w:val="en-IN" w:eastAsia="zh-CN"/>
+        </w:rPr>
+        <w:t xml:space="preserve">2023 Assessments for: </w:t>
+      </w:r>
+      <w:r>
+        <w:rPr>
+          <w:rFonts w:hint="default"/>
+          <w:b w:val="0"/>
+          <w:bCs/>
+          <w:color w:val="000000"/>
+          <w:sz w:val="24"/>
+          <w:szCs w:val="24"/>
+          <w:highlight w:val="white"/>
+          <w:lang w:val="en-US" w:eastAsia="zh-CN"/>
+        </w:rPr>
+        <w:t>Business Aligned Framework (BAF) Overview 2023, Six Sigma and Lean 2023</w:t>
+      </w:r>
+      <w:r>
+        <w:rPr>
+          <w:rFonts w:hint="default"/>
+          <w:b w:val="0"/>
+          <w:bCs/>
+          <w:color w:val="000000"/>
+          <w:sz w:val="24"/>
+          <w:szCs w:val="24"/>
+          <w:highlight w:val="white"/>
+          <w:lang w:val="en-IN" w:eastAsia="zh-CN"/>
+        </w:rPr>
+        <w:t>, LP Requirement Development 2023, LP Matrics 2023, LP_Risk &amp; Opportunity Management 2023</w:t>
+      </w:r>
+    </w:p>
+    <w:p>
+      <w:pPr>
+        <w:pStyle w:val="15"/>
+        <w:widowControl w:val="0"/>
+        <w:numPr>
+          <w:ilvl w:val="0"/>
+          <w:numId w:val="7"/>
+        </w:numPr>
+        <w:pBdr>
+          <w:top w:val="none" w:color="auto" w:sz="0" w:space="0"/>
+          <w:left w:val="none" w:color="auto" w:sz="0" w:space="0"/>
+          <w:bottom w:val="none" w:color="auto" w:sz="0" w:space="0"/>
+          <w:right w:val="none" w:color="auto" w:sz="0" w:space="0"/>
+          <w:between w:val="none" w:color="auto" w:sz="0" w:space="0"/>
+        </w:pBdr>
+        <w:tabs>
+          <w:tab w:val="left" w:pos="720"/>
+        </w:tabs>
+        <w:spacing w:after="0"/>
+        <w:ind w:right="-180"/>
+        <w:rPr>
+          <w:rFonts w:hint="default"/>
+          <w:b/>
+          <w:color w:val="000000"/>
+          <w:sz w:val="24"/>
+          <w:szCs w:val="24"/>
+          <w:highlight w:val="white"/>
+          <w:lang w:val="en-US" w:eastAsia="zh-CN"/>
+        </w:rPr>
+      </w:pPr>
+      <w:bookmarkStart w:id="1" w:name="_GoBack"/>
+      <w:r>
+        <w:rPr>
+          <w:rFonts w:hint="default"/>
+          <w:b/>
+          <w:bCs w:val="0"/>
+          <w:color w:val="000000"/>
+          <w:sz w:val="24"/>
+          <w:szCs w:val="24"/>
+          <w:highlight w:val="white"/>
+          <w:lang w:val="en-US" w:eastAsia="zh-CN"/>
+        </w:rPr>
+        <w:t xml:space="preserve">Performance </w:t>
+      </w:r>
+      <w:r>
+        <w:rPr>
+          <w:rFonts w:hint="default"/>
+          <w:b/>
+          <w:bCs w:val="0"/>
+          <w:color w:val="000000"/>
+          <w:sz w:val="24"/>
+          <w:szCs w:val="24"/>
+          <w:highlight w:val="white"/>
+          <w:lang w:val="en-IN" w:eastAsia="zh-CN"/>
+        </w:rPr>
+        <w:t>M</w:t>
+      </w:r>
+      <w:r>
+        <w:rPr>
+          <w:rFonts w:hint="default"/>
+          <w:b/>
+          <w:bCs w:val="0"/>
+          <w:color w:val="000000"/>
+          <w:sz w:val="24"/>
+          <w:szCs w:val="24"/>
+          <w:highlight w:val="white"/>
+          <w:lang w:val="en-US" w:eastAsia="zh-CN"/>
+        </w:rPr>
+        <w:t>anagement 2022</w:t>
+      </w:r>
+      <w:bookmarkEnd w:id="1"/>
+      <w:r>
+        <w:rPr>
+          <w:rFonts w:hint="default"/>
+          <w:b w:val="0"/>
+          <w:bCs/>
+          <w:color w:val="000000"/>
+          <w:sz w:val="24"/>
+          <w:szCs w:val="24"/>
+          <w:highlight w:val="white"/>
+          <w:lang w:val="en-US" w:eastAsia="zh-CN"/>
+        </w:rPr>
+        <w:t>,</w:t>
+      </w:r>
+      <w:r>
+        <w:rPr>
+          <w:rFonts w:hint="default"/>
+          <w:b w:val="0"/>
+          <w:bCs/>
+          <w:color w:val="000000"/>
+          <w:sz w:val="24"/>
+          <w:szCs w:val="24"/>
+          <w:highlight w:val="white"/>
+          <w:lang w:val="en-IN" w:eastAsia="zh-CN"/>
+        </w:rPr>
+        <w:t xml:space="preserve"> </w:t>
+      </w:r>
+      <w:r>
+        <w:rPr>
+          <w:rFonts w:hint="default"/>
+          <w:b w:val="0"/>
+          <w:bCs/>
+          <w:color w:val="000000"/>
+          <w:sz w:val="24"/>
+          <w:szCs w:val="24"/>
+          <w:highlight w:val="white"/>
+          <w:lang w:val="en-US" w:eastAsia="zh-CN"/>
+        </w:rPr>
+        <w:t>Telecom Basics 2020, CMMI 2.0 2020, HIPPA Security 2020</w:t>
+      </w:r>
+    </w:p>
+    <w:p>
+      <w:pPr>
+        <w:pStyle w:val="15"/>
+        <w:widowControl w:val="0"/>
+        <w:numPr>
+          <w:ilvl w:val="0"/>
+          <w:numId w:val="7"/>
+        </w:numPr>
+        <w:pBdr>
+          <w:top w:val="none" w:color="auto" w:sz="0" w:space="0"/>
+          <w:left w:val="none" w:color="auto" w:sz="0" w:space="0"/>
+          <w:bottom w:val="none" w:color="auto" w:sz="0" w:space="0"/>
+          <w:right w:val="none" w:color="auto" w:sz="0" w:space="0"/>
+          <w:between w:val="none" w:color="auto" w:sz="0" w:space="0"/>
+        </w:pBdr>
+        <w:tabs>
+          <w:tab w:val="left" w:pos="720"/>
+        </w:tabs>
+        <w:spacing w:after="0"/>
+        <w:ind w:right="-180"/>
+        <w:rPr>
+          <w:rFonts w:hint="default"/>
+          <w:b/>
+          <w:bCs w:val="0"/>
+          <w:color w:val="000000"/>
+          <w:sz w:val="24"/>
+          <w:szCs w:val="24"/>
+          <w:highlight w:val="white"/>
+          <w:lang w:val="en-IN"/>
+        </w:rPr>
+      </w:pPr>
+      <w:r>
+        <w:rPr>
+          <w:rFonts w:hint="default"/>
+          <w:b/>
+          <w:bCs w:val="0"/>
+          <w:color w:val="000000"/>
+          <w:sz w:val="24"/>
+          <w:szCs w:val="24"/>
+          <w:highlight w:val="white"/>
+          <w:lang w:val="en-US" w:eastAsia="zh-CN"/>
+        </w:rPr>
+        <w:t>Core PMI 2017, Agile Foundation 2017</w:t>
+      </w:r>
+      <w:r>
+        <w:rPr>
+          <w:rFonts w:hint="default"/>
+          <w:b/>
+          <w:bCs w:val="0"/>
+          <w:color w:val="000000"/>
+          <w:sz w:val="24"/>
+          <w:szCs w:val="24"/>
+          <w:highlight w:val="white"/>
+          <w:lang w:val="en-IN" w:eastAsia="zh-CN"/>
+        </w:rPr>
+        <w:t xml:space="preserve">, </w:t>
+      </w:r>
+      <w:r>
+        <w:rPr>
+          <w:rFonts w:hint="default"/>
+          <w:b/>
+          <w:bCs w:val="0"/>
+          <w:color w:val="000000"/>
+          <w:sz w:val="24"/>
+          <w:szCs w:val="24"/>
+          <w:highlight w:val="white"/>
+        </w:rPr>
+        <w:t>ERS-EXA Lead and Technical Manager - PM Track – Pre-assessment</w:t>
+      </w:r>
+      <w:r>
+        <w:rPr>
+          <w:rFonts w:hint="default"/>
+          <w:b/>
+          <w:bCs w:val="0"/>
+          <w:color w:val="000000"/>
+          <w:sz w:val="24"/>
+          <w:szCs w:val="24"/>
+          <w:highlight w:val="white"/>
+          <w:lang w:val="en-IN"/>
+        </w:rPr>
+        <w:t xml:space="preserve"> 2017</w:t>
+      </w:r>
+    </w:p>
+    <w:p>
+      <w:pPr>
+        <w:pStyle w:val="15"/>
+        <w:widowControl w:val="0"/>
+        <w:numPr>
+          <w:ilvl w:val="0"/>
+          <w:numId w:val="7"/>
+        </w:numPr>
+        <w:pBdr>
+          <w:top w:val="none" w:color="auto" w:sz="0" w:space="0"/>
+          <w:left w:val="none" w:color="auto" w:sz="0" w:space="0"/>
+          <w:bottom w:val="none" w:color="auto" w:sz="0" w:space="0"/>
+          <w:right w:val="none" w:color="auto" w:sz="0" w:space="0"/>
+          <w:between w:val="none" w:color="auto" w:sz="0" w:space="0"/>
+        </w:pBdr>
+        <w:tabs>
+          <w:tab w:val="left" w:pos="720"/>
+        </w:tabs>
+        <w:spacing w:after="0"/>
+        <w:ind w:right="-180"/>
+        <w:rPr>
+          <w:rFonts w:hint="default"/>
+          <w:b/>
+          <w:color w:val="000000"/>
+          <w:sz w:val="24"/>
+          <w:szCs w:val="24"/>
+          <w:highlight w:val="white"/>
+          <w:lang w:val="en-IN" w:eastAsia="zh-CN"/>
+        </w:rPr>
+      </w:pPr>
+      <w:r>
+        <w:rPr>
+          <w:rFonts w:hint="default"/>
+          <w:b/>
+          <w:color w:val="000000"/>
+          <w:sz w:val="24"/>
+          <w:szCs w:val="24"/>
+          <w:highlight w:val="white"/>
+          <w:lang w:val="en-IN" w:eastAsia="zh-CN"/>
+        </w:rPr>
+        <w:t>Delivery Management(DQI) and Metrics Portal  training(PM/PMO) 2017,</w:t>
+      </w:r>
+      <w:r>
+        <w:rPr>
+          <w:rFonts w:hint="default"/>
+          <w:b w:val="0"/>
+          <w:bCs/>
+          <w:color w:val="000000"/>
+          <w:sz w:val="24"/>
+          <w:szCs w:val="24"/>
+          <w:highlight w:val="white"/>
+          <w:lang w:val="en-IN" w:eastAsia="zh-CN"/>
+        </w:rPr>
+        <w:t xml:space="preserve"> Network Management Software Assessment 2017</w:t>
+      </w:r>
+    </w:p>
+    <w:p>
+      <w:pPr>
+        <w:pStyle w:val="15"/>
+        <w:widowControl w:val="0"/>
+        <w:numPr>
+          <w:ilvl w:val="0"/>
+          <w:numId w:val="7"/>
+        </w:numPr>
+        <w:pBdr>
+          <w:top w:val="none" w:color="auto" w:sz="0" w:space="0"/>
+          <w:left w:val="none" w:color="auto" w:sz="0" w:space="0"/>
+          <w:bottom w:val="none" w:color="auto" w:sz="0" w:space="0"/>
+          <w:right w:val="none" w:color="auto" w:sz="0" w:space="0"/>
+          <w:between w:val="none" w:color="auto" w:sz="0" w:space="0"/>
+        </w:pBdr>
+        <w:tabs>
+          <w:tab w:val="left" w:pos="720"/>
+        </w:tabs>
+        <w:spacing w:after="0"/>
+        <w:ind w:right="-180"/>
+        <w:rPr>
+          <w:b/>
+          <w:color w:val="000000"/>
+          <w:sz w:val="24"/>
+          <w:szCs w:val="24"/>
+          <w:highlight w:val="white"/>
+        </w:rPr>
+      </w:pPr>
+      <w:r>
+        <w:rPr>
+          <w:rFonts w:hint="default"/>
+          <w:b/>
+          <w:color w:val="000000"/>
+          <w:sz w:val="24"/>
+          <w:szCs w:val="24"/>
+          <w:highlight w:val="white"/>
+          <w:lang w:val="en-IN" w:eastAsia="zh-CN"/>
+        </w:rPr>
+        <w:t>Behavioral JBC Track 2016, Information Security 2016, Need a Systematic Approach 2016, Python Basic and Indeterminate 2016</w:t>
+      </w:r>
+    </w:p>
+    <w:p>
+      <w:pPr>
+        <w:widowControl w:val="0"/>
+        <w:pBdr>
+          <w:top w:val="none" w:color="auto" w:sz="0" w:space="0"/>
+          <w:left w:val="none" w:color="auto" w:sz="0" w:space="0"/>
+          <w:bottom w:val="none" w:color="auto" w:sz="0" w:space="0"/>
+          <w:right w:val="none" w:color="auto" w:sz="0" w:space="0"/>
+          <w:between w:val="none" w:color="auto" w:sz="0" w:space="0"/>
+        </w:pBdr>
+        <w:tabs>
+          <w:tab w:val="left" w:pos="720"/>
+        </w:tabs>
+        <w:spacing w:after="0"/>
+        <w:ind w:right="-180"/>
+        <w:rPr>
+          <w:b/>
+          <w:color w:val="000000"/>
+          <w:sz w:val="24"/>
+          <w:szCs w:val="24"/>
+          <w:highlight w:val="white"/>
+        </w:rPr>
+      </w:pPr>
+    </w:p>
+    <w:p>
+      <w:pPr>
+        <w:widowControl w:val="0"/>
+        <w:pBdr>
+          <w:top w:val="none" w:color="auto" w:sz="0" w:space="0"/>
+          <w:left w:val="none" w:color="auto" w:sz="0" w:space="0"/>
+          <w:bottom w:val="none" w:color="auto" w:sz="0" w:space="0"/>
+          <w:right w:val="none" w:color="auto" w:sz="0" w:space="0"/>
+          <w:between w:val="none" w:color="auto" w:sz="0" w:space="0"/>
+        </w:pBdr>
+        <w:tabs>
+          <w:tab w:val="left" w:pos="720"/>
+        </w:tabs>
+        <w:spacing w:after="0"/>
+        <w:ind w:right="-180"/>
+        <w:rPr>
+          <w:b/>
+          <w:color w:val="000000"/>
+          <w:sz w:val="24"/>
+          <w:szCs w:val="24"/>
+          <w:highlight w:val="white"/>
+        </w:rPr>
+      </w:pPr>
+    </w:p>
+    <w:p>
+      <w:pPr>
+        <w:pBdr>
+          <w:top w:val="none" w:color="auto" w:sz="0" w:space="0"/>
+          <w:left w:val="none" w:color="auto" w:sz="0" w:space="0"/>
+          <w:bottom w:val="none" w:color="auto" w:sz="0" w:space="0"/>
+          <w:right w:val="none" w:color="auto" w:sz="0" w:space="0"/>
+          <w:between w:val="none" w:color="auto" w:sz="0" w:space="0"/>
+        </w:pBdr>
+        <w:shd w:val="clear" w:color="auto" w:fill="F2F2F2"/>
+        <w:rPr>
+          <w:b/>
+          <w:color w:val="000000"/>
+          <w:sz w:val="24"/>
+          <w:szCs w:val="24"/>
+        </w:rPr>
+      </w:pPr>
+      <w:r>
+        <w:rPr>
           <w:b/>
           <w:color w:val="000000"/>
           <w:sz w:val="24"/>
@@ -3543,6 +4298,15 @@
       </w:r>
       <w:r>
         <w:rPr>
+          <w:rFonts w:hint="default"/>
+          <w:color w:val="000000"/>
+          <w:highlight w:val="white"/>
+          <w:lang w:val="en-IN"/>
+        </w:rPr>
+        <w:tab/>
+      </w:r>
+      <w:r>
+        <w:rPr>
           <w:color w:val="000000"/>
           <w:highlight w:val="white"/>
         </w:rPr>
@@ -3594,7 +4358,7 @@
           <w:highlight w:val="white"/>
           <w:lang w:val="en-IN"/>
         </w:rPr>
-        <w:t>MBA</w:t>
+        <w:t>MBA Marketing</w:t>
       </w:r>
       <w:r>
         <w:rPr>
@@ -3604,7 +4368,6 @@
           <w:lang w:val="en-IN"/>
         </w:rPr>
         <w:tab/>
-        <w:t/>
       </w:r>
       <w:r>
         <w:rPr>
@@ -3614,7 +4377,6 @@
           <w:lang w:val="en-IN"/>
         </w:rPr>
         <w:tab/>
-        <w:t/>
       </w:r>
       <w:r>
         <w:rPr>
@@ -3624,7 +4386,6 @@
           <w:lang w:val="en-IN"/>
         </w:rPr>
         <w:tab/>
-        <w:t/>
       </w:r>
       <w:r>
         <w:rPr>
@@ -3715,8 +4476,6 @@
           <w:highlight w:val="white"/>
         </w:rPr>
       </w:pPr>
-      <w:bookmarkStart w:id="1" w:name="_GoBack"/>
-      <w:bookmarkEnd w:id="1"/>
     </w:p>
     <w:p>
       <w:pPr>
@@ -5599,12 +6358,29 @@
 </file>
 
 <file path=customXml/item1.xml><?xml version="1.0" encoding="utf-8"?>
+<s:customData xmlns="http://www.wps.cn/officeDocument/2013/wpsCustomData" xmlns:s="http://www.wps.cn/officeDocument/2013/wpsCustomData">
+  <customSectProps/>
+  <customShpExts>
+    <customShpInfo spid="_x0000_s1026" textRotate="1"/>
+  </customShpExts>
+</s:customData>
+</file>
+
+<file path=customXml/item2.xml><?xml version="1.0" encoding="utf-8"?>
 <go:gDocsCustomXmlDataStorage xmlns:go="http://customooxmlschemas.google.com/" xmlns:r="http://schemas.openxmlformats.org/officeDocument/2006/relationships" uri="GoogleDocsCustomDataVersion1">
   <go:docsCustomData xmlns:go="http://customooxmlschemas.google.com/" roundtripDataSignature="AMtx7mhRVZk8+p7VfLAKytoe+Lh4FM2FpA==">AMUW2mVSY01fkuK7M04DD7xJ1eQHNLVZU7b//jTdJm0PUVRP5PYzm/K6ygYHibsbxYqbgpLof1ujNRGhBR8iHDljjAliPlTrYI/npA2onW5sa9ZsSfSzbOnGjiIcn5jqnPQ6aGLuJ5/J</go:docsCustomData>
 </go:gDocsCustomXmlDataStorage>
 </file>
 
 <file path=customXml/itemProps1.xml><?xml version="1.0" encoding="utf-8"?>
+<ds:datastoreItem xmlns:ds="http://schemas.openxmlformats.org/officeDocument/2006/customXml" ds:itemID="{B1977F7D-205B-4081-913C-38D41E755F92}">
+  <ds:schemaRefs>
+    <ds:schemaRef ds:uri="http://www.wps.cn/officeDocument/2013/wpsCustomData"/>
+  </ds:schemaRefs>
+</ds:datastoreItem>
+</file>
+
+<file path=customXml/itemProps2.xml><?xml version="1.0" encoding="utf-8"?>
 <ds:datastoreItem xmlns:ds="http://schemas.openxmlformats.org/officeDocument/2006/customXml" ds:itemID="{11111111-1234-1234-1234-123412341234}">
   <ds:schemaRefs/>
 </ds:datastoreItem>

</xml_diff>